<commit_message>
Remove phone number and shorten location to Riverside, CA
Drops the phone row from Contact and the `phone` field from the profile.
The served copy of the resume carried the number too, so it is stripped
there as well — leaving it in a publicly downloadable file would have made
removing it from the page pointless. The original in ~/Downloads is
untouched.
</commit_message>
<xml_diff>
--- a/public/Amy-Kuang-Resume.docx
+++ b/public/Amy-Kuang-Resume.docx
@@ -45,14 +45,14 @@
           <w:rFonts w:ascii="Times New Roman" w:hAnsi="Times New Roman"/>
           <w:color w:val="000000" w:themeColor="text1"/>
         </w:rPr>
-        <w:t>Riverside Area, CA</w:t>
-      </w:r>
-      <w:r>
-        <w:rPr>
-          <w:rFonts w:ascii="Times New Roman" w:hAnsi="Times New Roman"/>
-          <w:color w:val="000000" w:themeColor="text1"/>
-        </w:rPr>
-        <w:t xml:space="preserve"> | (951) 546-4767 | </w:t>
+        <w:t>Riverside, CA</w:t>
+      </w:r>
+      <w:r>
+        <w:rPr>
+          <w:rFonts w:ascii="Times New Roman" w:hAnsi="Times New Roman"/>
+          <w:color w:val="000000" w:themeColor="text1"/>
+        </w:rPr>
+        <w:t xml:space="preserve"> | </w:t>
       </w:r>
       <w:r>
         <w:rPr>

</xml_diff>